<commit_message>
Add: Upload file PDF baru ke folder docs Week03
</commit_message>
<xml_diff>
--- a/Week03/docs/Sukma Ananda Putri_SIB 2F_18_Jobsheet 3 - Percabangan, Perulangan, dan Operasi Git Lanjutan pada Dart.docx
+++ b/Week03/docs/Sukma Ananda Putri_SIB 2F_18_Jobsheet 3 - Percabangan, Perulangan, dan Operasi Git Lanjutan pada Dart.docx
@@ -943,7 +943,7 @@
           <w:kern w:val="0"/>
           <w:sz w:val="21"/>
           <w:szCs w:val="21"/>
-          <w:lang w:val="en-ID" w:eastAsia="en-ID"/>
+          <w:lang w:val="sv-SE" w:eastAsia="en-ID"/>
           <w14:ligatures w14:val="none"/>
         </w:rPr>
         <w:t xml:space="preserve">  </w:t>
@@ -3226,6 +3226,7 @@
           <w:rFonts w:ascii="Times New Roman" w:hAnsi="Times New Roman" w:cs="Times New Roman"/>
           <w:b/>
           <w:bCs/>
+          <w:noProof/>
           <w:lang w:val="sv-SE"/>
         </w:rPr>
         <w:lastRenderedPageBreak/>
@@ -5732,6 +5733,7 @@
       <w:r>
         <w:rPr>
           <w:rFonts w:ascii="Times New Roman" w:hAnsi="Times New Roman" w:cs="Times New Roman"/>
+          <w:noProof/>
           <w:lang w:val="sv-SE"/>
         </w:rPr>
         <w:drawing>
@@ -5775,17 +5777,26 @@
       <w:pPr>
         <w:rPr>
           <w:rFonts w:ascii="Times New Roman" w:hAnsi="Times New Roman" w:cs="Times New Roman"/>
-          <w:lang w:val="sv-SE"/>
-        </w:rPr>
-      </w:pPr>
-    </w:p>
-    <w:p>
-      <w:pPr>
+          <w:lang w:val="en-ID"/>
+        </w:rPr>
+      </w:pPr>
+      <w:r>
         <w:rPr>
           <w:rFonts w:ascii="Times New Roman" w:hAnsi="Times New Roman" w:cs="Times New Roman"/>
-          <w:lang w:val="sv-SE"/>
-        </w:rPr>
-      </w:pPr>
+          <w:lang w:val="en-ID"/>
+        </w:rPr>
+        <w:t xml:space="preserve">Link Github : </w:t>
+      </w:r>
+      <w:hyperlink r:id="rId8" w:history="1">
+        <w:r>
+          <w:rPr>
+            <w:rStyle w:val="Hyperlink"/>
+            <w:rFonts w:ascii="Times New Roman" w:hAnsi="Times New Roman" w:cs="Times New Roman"/>
+            <w:lang w:val="en-ID"/>
+          </w:rPr>
+          <w:t>https://github.com/sukmaannda/PemrogramanMobile/tree/main/Week03</w:t>
+        </w:r>
+      </w:hyperlink>
     </w:p>
     <w:sectPr>
       <w:pgSz w:w="11906" w:h="16838"/>
@@ -6506,6 +6517,7 @@
   <w:style w:type="character" w:default="1" w:styleId="DefaultParagraphFont">
     <w:name w:val="Default Paragraph Font"/>
     <w:uiPriority w:val="1"/>
+    <w:semiHidden/>
     <w:unhideWhenUsed/>
   </w:style>
   <w:style w:type="table" w:default="1" w:styleId="TableNormal">
@@ -6843,6 +6855,29 @@
       </w:tblBorders>
     </w:tblPr>
   </w:style>
+  <w:style w:type="character" w:styleId="Hyperlink">
+    <w:name w:val="Hyperlink"/>
+    <w:basedOn w:val="DefaultParagraphFont"/>
+    <w:uiPriority w:val="99"/>
+    <w:unhideWhenUsed/>
+    <w:rsid w:val="00394F50"/>
+    <w:rPr>
+      <w:color w:val="0563C1" w:themeColor="hyperlink"/>
+      <w:u w:val="single"/>
+    </w:rPr>
+  </w:style>
+  <w:style w:type="character" w:styleId="UnresolvedMention">
+    <w:name w:val="Unresolved Mention"/>
+    <w:basedOn w:val="DefaultParagraphFont"/>
+    <w:uiPriority w:val="99"/>
+    <w:semiHidden/>
+    <w:unhideWhenUsed/>
+    <w:rsid w:val="00394F50"/>
+    <w:rPr>
+      <w:color w:val="605E5C"/>
+      <w:shd w:val="clear" w:color="auto" w:fill="E1DFDD"/>
+    </w:rPr>
+  </w:style>
 </w:styles>
 </file>
 

</xml_diff>